<commit_message>
Address code review: portable path, skip empty card subtitle, drop redundant color
- Use a path relative to the script instead of a hardcoded absolute path
- Only add the package 'who' subtitle paragraph when it is non-empty
- Remove the redundant white font-color assignment in the cta helper
</commit_message>
<xml_diff>
--- a/Well-and-Good-Websites-Copy-Deck-Revised-2026-06-16.docx
+++ b/Well-and-Good-Websites-Copy-Deck-Revised-2026-06-16.docx
@@ -1066,13 +1066,6 @@
       </w:r>
     </w:p>
     <w:p>
-      <w:r>
-        <w:rPr>
-          <w:i/>
-        </w:rPr>
-      </w:r>
-    </w:p>
-    <w:p>
       <w:pPr>
         <w:pStyle w:val="ListBullet"/>
       </w:pPr>
@@ -1113,13 +1106,6 @@
       </w:r>
     </w:p>
     <w:p>
-      <w:r>
-        <w:rPr>
-          <w:i/>
-        </w:rPr>
-      </w:r>
-    </w:p>
-    <w:p>
       <w:pPr>
         <w:pStyle w:val="ListBullet"/>
       </w:pPr>
@@ -1158,13 +1144,6 @@
           <w:sz w:val="26"/>
         </w:rPr>
         <w:t>Premium — $1,497</w:t>
-      </w:r>
-    </w:p>
-    <w:p>
-      <w:r>
-        <w:rPr>
-          <w:i/>
-        </w:rPr>
       </w:r>
     </w:p>
     <w:p>
@@ -1424,13 +1403,6 @@
       </w:r>
     </w:p>
     <w:p>
-      <w:r>
-        <w:rPr>
-          <w:i/>
-        </w:rPr>
-      </w:r>
-    </w:p>
-    <w:p>
       <w:pPr>
         <w:pStyle w:val="ListBullet"/>
       </w:pPr>
@@ -1479,13 +1451,6 @@
       </w:r>
     </w:p>
     <w:p>
-      <w:r>
-        <w:rPr>
-          <w:i/>
-        </w:rPr>
-      </w:r>
-    </w:p>
-    <w:p>
       <w:pPr>
         <w:pStyle w:val="ListBullet"/>
       </w:pPr>
@@ -1524,13 +1489,6 @@
           <w:sz w:val="26"/>
         </w:rPr>
         <w:t>Premium: $1,497</w:t>
-      </w:r>
-    </w:p>
-    <w:p>
-      <w:r>
-        <w:rPr>
-          <w:i/>
-        </w:rPr>
       </w:r>
     </w:p>
     <w:p>

</xml_diff>

<commit_message>
Add recurring care plans, transparency and no-lock-in angles to copy deck
- New homepage care-plan section (Essential/Growth/Pro) with $XX placeholders
- Expanded FAQ: cost-to-keep-online, edits-included, no contract/lock-in; sharpened the Wix/Squarespace answer with a done-for-you frame
- Folded transparent-pricing and no-lock-in messaging into all four pages
- Kept margins, cost structure, AI mechanism, and competitor multiples off the site
</commit_message>
<xml_diff>
--- a/Well-and-Good-Websites-Copy-Deck-Revised-2026-06-16.docx
+++ b/Well-and-Good-Websites-Copy-Deck-Revised-2026-06-16.docx
@@ -20,7 +20,7 @@
           <w:i/>
           <w:color w:val="555555"/>
         </w:rPr>
-        <w:t>Revised 2026-06-16 · reflects updated positioning (custom websites for small and medium businesses)</w:t>
+        <w:t>Revised 2026-06-16 · updated positioning, transparent pricing, and optional care plans (recurring)</w:t>
       </w:r>
     </w:p>
     <w:p>
@@ -61,6 +61,30 @@
       </w:pPr>
       <w:r>
         <w:t>Niagara/Toronto local SEO targeting kept intact (organic focus unchanged).</w:t>
+      </w:r>
+    </w:p>
+    <w:p>
+      <w:pPr>
+        <w:pStyle w:val="ListBullet"/>
+      </w:pPr>
+      <w:r>
+        <w:t>NEW: optional recurring care plans (Essential / Growth / Pro) added to the homepage and woven into the FAQ — pricing left as $XX placeholders until you decide.</w:t>
+      </w:r>
+    </w:p>
+    <w:p>
+      <w:pPr>
+        <w:pStyle w:val="ListBullet"/>
+      </w:pPr>
+      <w:r>
+        <w:t>NEW: transparency wedge (“every price is on the page”) and “no lock-in / cancel anytime” folded through all pages — angles drawn from the competitor pricing analysis.</w:t>
+      </w:r>
+    </w:p>
+    <w:p>
+      <w:pPr>
+        <w:pStyle w:val="ListBullet"/>
+      </w:pPr>
+      <w:r>
+        <w:t>Kept OFF the site by design: margins, cost structure, “AI-built” as a lead message, and hard competitor price multiples (accuracy/legal risk).</w:t>
       </w:r>
     </w:p>
     <w:p>
@@ -369,6 +393,11 @@
     </w:p>
     <w:p>
       <w:r>
+        <w:t>Every price is on the page. Most agencies make you request a quote first — here you can decide before you ever call.</w:t>
+      </w:r>
+    </w:p>
+    <w:p>
+      <w:r>
         <w:rPr>
           <w:b/>
           <w:sz w:val="26"/>
@@ -550,6 +579,203 @@
         <w:pStyle w:val="Heading2"/>
       </w:pPr>
       <w:r>
+        <w:t>Live — and looked after.</w:t>
+      </w:r>
+    </w:p>
+    <w:p>
+      <w:r>
+        <w:t>Your site is yours, with no lock-in. An optional care plan keeps it hosted, secure, backed up, and current — and small edits are included, not billed by the quarter-hour. Every price is published; cancel anytime, or pay yearly for two months free.</w:t>
+      </w:r>
+    </w:p>
+    <w:p>
+      <w:r>
+        <w:rPr>
+          <w:b/>
+          <w:sz w:val="26"/>
+        </w:rPr>
+        <w:t>Essential — $XX/mo  ($XXX/yr)</w:t>
+      </w:r>
+    </w:p>
+    <w:p>
+      <w:r>
+        <w:rPr>
+          <w:i/>
+        </w:rPr>
+        <w:t>Keep the site online, secure, and current.</w:t>
+      </w:r>
+    </w:p>
+    <w:p>
+      <w:pPr>
+        <w:pStyle w:val="ListBullet"/>
+      </w:pPr>
+      <w:r>
+        <w:t>Fast, secure hosting and SSL</w:t>
+      </w:r>
+    </w:p>
+    <w:p>
+      <w:pPr>
+        <w:pStyle w:val="ListBullet"/>
+      </w:pPr>
+      <w:r>
+        <w:t>Domain and uptime monitoring</w:t>
+      </w:r>
+    </w:p>
+    <w:p>
+      <w:pPr>
+        <w:pStyle w:val="ListBullet"/>
+      </w:pPr>
+      <w:r>
+        <w:t>Automatic backups</w:t>
+      </w:r>
+    </w:p>
+    <w:p>
+      <w:pPr>
+        <w:pStyle w:val="ListBullet"/>
+      </w:pPr>
+      <w:r>
+        <w:t>One content edit a month (hours, photos, text)</w:t>
+      </w:r>
+    </w:p>
+    <w:p>
+      <w:pPr>
+        <w:pStyle w:val="ListBullet"/>
+      </w:pPr>
+      <w:r>
+        <w:t>Email and Telegram support</w:t>
+      </w:r>
+    </w:p>
+    <w:p>
+      <w:r>
+        <w:rPr>
+          <w:b/>
+          <w:sz w:val="26"/>
+        </w:rPr>
+        <w:t>Growth — $XX/mo  ($XXX/yr)</w:t>
+      </w:r>
+      <w:r>
+        <w:rPr>
+          <w:b/>
+          <w:color w:val="1A534F"/>
+        </w:rPr>
+        <w:t xml:space="preserve">   ★ MOST POPULAR</w:t>
+      </w:r>
+    </w:p>
+    <w:p>
+      <w:r>
+        <w:rPr>
+          <w:i/>
+        </w:rPr>
+        <w:t>For businesses whose details change often.</w:t>
+      </w:r>
+    </w:p>
+    <w:p>
+      <w:pPr>
+        <w:pStyle w:val="ListBullet"/>
+      </w:pPr>
+      <w:r>
+        <w:t>Everything in Essential</w:t>
+      </w:r>
+    </w:p>
+    <w:p>
+      <w:pPr>
+        <w:pStyle w:val="ListBullet"/>
+      </w:pPr>
+      <w:r>
+        <w:t>Unlimited small content edits, 24–48 hour turnaround</w:t>
+      </w:r>
+    </w:p>
+    <w:p>
+      <w:pPr>
+        <w:pStyle w:val="ListBullet"/>
+      </w:pPr>
+      <w:r>
+        <w:t>Quarterly booking and link check</w:t>
+      </w:r>
+    </w:p>
+    <w:p>
+      <w:pPr>
+        <w:pStyle w:val="ListBullet"/>
+      </w:pPr>
+      <w:r>
+        <w:t>One seasonal refresh a year</w:t>
+      </w:r>
+    </w:p>
+    <w:p>
+      <w:r>
+        <w:rPr>
+          <w:b/>
+          <w:sz w:val="26"/>
+        </w:rPr>
+        <w:t>Pro — $XX/mo  ($XXX/yr)</w:t>
+      </w:r>
+    </w:p>
+    <w:p>
+      <w:r>
+        <w:rPr>
+          <w:i/>
+        </w:rPr>
+        <w:t>Your site plus an active local presence.</w:t>
+      </w:r>
+    </w:p>
+    <w:p>
+      <w:pPr>
+        <w:pStyle w:val="ListBullet"/>
+      </w:pPr>
+      <w:r>
+        <w:t>Everything in Growth</w:t>
+      </w:r>
+    </w:p>
+    <w:p>
+      <w:pPr>
+        <w:pStyle w:val="ListBullet"/>
+      </w:pPr>
+      <w:r>
+        <w:t>Google Business Profile management</w:t>
+      </w:r>
+    </w:p>
+    <w:p>
+      <w:pPr>
+        <w:pStyle w:val="ListBullet"/>
+      </w:pPr>
+      <w:r>
+        <w:t>Review-funnel upkeep</w:t>
+      </w:r>
+    </w:p>
+    <w:p>
+      <w:pPr>
+        <w:pStyle w:val="ListBullet"/>
+      </w:pPr>
+      <w:r>
+        <w:t>Light monthly local SEO with a plain-English performance note</w:t>
+      </w:r>
+    </w:p>
+    <w:p>
+      <w:pPr>
+        <w:pStyle w:val="ListBullet"/>
+      </w:pPr>
+      <w:r>
+        <w:t>Priority turnaround</w:t>
+      </w:r>
+    </w:p>
+    <w:p>
+      <w:r>
+        <w:t>New builds get the first month free on the matching plan. Prefer to handle your own updates? You can — single edits start at $XX, no plan required.</w:t>
+      </w:r>
+    </w:p>
+    <w:p>
+      <w:r>
+        <w:rPr>
+          <w:b/>
+          <w:color w:val="B00000"/>
+        </w:rPr>
+        <w:t>⚑ [CARE-PLAN PRICING NOT FINAL — $XX / $XXX are placeholders. Recommendation on the table: $19 / $39 / $79 monthly. Drop final numbers in here and in the FAQ once decided.]</w:t>
+      </w:r>
+    </w:p>
+    <w:p>
+      <w:pPr>
+        <w:pStyle w:val="Heading2"/>
+      </w:pPr>
+      <w:r>
         <w:t>Website design for local searches</w:t>
       </w:r>
     </w:p>
@@ -737,7 +963,7 @@
     </w:p>
     <w:p>
       <w:r>
-        <w:t>Well and Good Websites offers three clear packages: $497, $997, and $1,497. The right fit depends on how much copy, photography, booking flow, review support, and launch help your business needs.</w:t>
+        <w:t>Every price is published up front — no “request a quote” maze. The build is a one-time $497, $997, or $1,497, and the right fit depends on how much copy, photography, booking flow, review support, and launch help you need. Keeping the site online afterward is an optional care plan, also priced openly.</w:t>
       </w:r>
     </w:p>
     <w:p>
@@ -789,7 +1015,46 @@
     </w:p>
     <w:p>
       <w:r>
-        <w:t>Website builders can work if you have the time and confidence to write, design, structure, and launch the site yourself. Well and Good is for owners who want a custom site done quickly around their real business.</w:t>
+        <w:t>Website builders can work if you have the time and confidence to write, design, structure, and launch the site yourself. Well and Good is done for you — like the bigger online website services, but without a large setup fee or a $200-a-month plan — and built fast around your real business.</w:t>
+      </w:r>
+    </w:p>
+    <w:p>
+      <w:pPr>
+        <w:pStyle w:val="Heading3"/>
+      </w:pPr>
+      <w:r>
+        <w:t>What does it cost to keep my site online?</w:t>
+      </w:r>
+    </w:p>
+    <w:p>
+      <w:r>
+        <w:t>Hosting, security, backups, and small updates are handled through an optional care plan, published up front from $XX a month — no setup fee, no lock-in. Prefer not to subscribe? You can pay per edit instead.</w:t>
+      </w:r>
+    </w:p>
+    <w:p>
+      <w:pPr>
+        <w:pStyle w:val="Heading3"/>
+      </w:pPr>
+      <w:r>
+        <w:t>Can I change my site after it’s live?</w:t>
+      </w:r>
+    </w:p>
+    <w:p>
+      <w:r>
+        <w:t>Yes. Send the change by message — hours, a photo, a price, a new section — and I make it for you. On the Growth and Pro care plans, small edits are included instead of billed by the quarter-hour.</w:t>
+      </w:r>
+    </w:p>
+    <w:p>
+      <w:pPr>
+        <w:pStyle w:val="Heading3"/>
+      </w:pPr>
+      <w:r>
+        <w:t>Is there a contract or lock-in?</w:t>
+      </w:r>
+    </w:p>
+    <w:p>
+      <w:r>
+        <w:t>No. Care plans are month to month, you can cancel anytime, and you own your domain. Pay yearly if you’d like two months free — but you are never locked in.</w:t>
       </w:r>
     </w:p>
     <w:p>
@@ -1193,6 +1458,11 @@
     </w:p>
     <w:p>
       <w:r>
+        <w:t>Prices are published up front, and the optional care plan keeps your site current with no lock-in.</w:t>
+      </w:r>
+    </w:p>
+    <w:p>
+      <w:r>
         <w:rPr>
           <w:b/>
           <w:color w:val="1A534F"/>
@@ -1364,7 +1634,7 @@
     </w:p>
     <w:p>
       <w:r>
-        <w:t>Packages are visible from the start, so you can decide what level of help makes sense.</w:t>
+        <w:t>Every price is on the page — builds and care plans both. No “request a quote” maze, no surprise invoice. Most agencies nearby hide their pricing; here you decide before you ever call.</w:t>
       </w:r>
     </w:p>
     <w:p>
@@ -1521,6 +1791,20 @@
       </w:pPr>
       <w:r>
         <w:t>Priority launch support</w:t>
+      </w:r>
+    </w:p>
+    <w:p>
+      <w:r>
+        <w:t>Keeping the site online afterward is an optional care plan from $XX a month — published up front, cancel anytime, and you own your domain. No lock-in, ever.</w:t>
+      </w:r>
+    </w:p>
+    <w:p>
+      <w:r>
+        <w:rPr>
+          <w:b/>
+          <w:color w:val="B00000"/>
+        </w:rPr>
+        <w:t>⚑ [CARE-PLAN PRICING placeholder $XX — keep in sync with the homepage care section.]</w:t>
       </w:r>
     </w:p>
     <w:p>
@@ -1864,6 +2148,11 @@
     <w:p>
       <w:r>
         <w:t>Send your business name, what customers need to do next, and any current links. I’ll map the simplest useful website for you.</w:t>
+      </w:r>
+    </w:p>
+    <w:p>
+      <w:r>
+        <w:t>Clear prices up front, and an optional care plan to keep it current — month to month, no lock-in.</w:t>
       </w:r>
     </w:p>
     <w:p>

</xml_diff>